<commit_message>
Fix: set Arial Unicode MS font for ₦ and GH₵ symbols in DOCX; wrap long App ID URLs
</commit_message>
<xml_diff>
--- a/CURRENCY_CONVERTER_API_Docs.docx
+++ b/CURRENCY_CONVERTER_API_Docs.docx
@@ -891,6 +891,7 @@
           <w:p>
             <w:r>
               <w:rPr>
+                <w:rFonts w:ascii="Arial Unicode MS" w:hAnsi="Arial Unicode MS" w:cs="Arial Unicode MS" w:eastAsia="Arial Unicode MS"/>
                 <w:color w:val="444444"/>
                 <w:sz w:val="16"/>
                 <w:szCs w:val="16"/>
@@ -1199,6 +1200,7 @@
           <w:p>
             <w:r>
               <w:rPr>
+                <w:rFonts w:ascii="Arial Unicode MS" w:hAnsi="Arial Unicode MS" w:cs="Arial Unicode MS" w:eastAsia="Arial Unicode MS"/>
                 <w:color w:val="444444"/>
                 <w:sz w:val="16"/>
                 <w:szCs w:val="16"/>
@@ -1561,11 +1563,17 @@
           <w:sz w:val="15"/>
           <w:szCs w:val="15"/>
         </w:rPr>
-        <w:t xml:space="preserve">Method  :  GET
-URL     :  https://openexchangerates.org/api/latest.json?app_id=9069645b9f1f4dc4bb634627a5e6d9d4&amp;symbols=NGN,USD,EUR,GBP,GHS
-Param   :  app_id = 9069645b9f1f4dc4bb634627a5e6d9d4   (Required: Yes)
-Param   :  symbols = NGN,USD,EUR,GBP,GHS   (Required: No)
-Status  :  200 OK</w:t>
+        <w:t>Method  :  GET</w:t>
+        <w:br/>
+        <w:t>URL     :  https://openexchangerates.org/api/latest.json?app_id=9069645b9f1f4dc4bb634627a5e6d9d4</w:t>
+        <w:br/>
+        <w:t xml:space="preserve">            &amp;symbols=NGN,USD,EUR,GBP,GHS</w:t>
+        <w:br/>
+        <w:t>Param   :  app_id = 9069645b9f1f4dc4bb634627a5e6d9d4   (Required: Yes)</w:t>
+        <w:br/>
+        <w:t>Param   :  symbols = NGN,USD,EUR,GBP,GHS   (Required: No)</w:t>
+        <w:br/>
+        <w:t>Status  :  200 OK</w:t>
       </w:r>
     </w:p>
     <w:p>
@@ -1677,11 +1685,17 @@
           <w:sz w:val="15"/>
           <w:szCs w:val="15"/>
         </w:rPr>
-        <w:t xml:space="preserve">Method  :  GET
-URL     :  https://openexchangerates.org/api/latest.json?app_id=9069645b9f1f4dc4bb634627a5e6d9d4&amp;symbols=NGN,USD
-Param   :  app_id = 9069645b9f1f4dc4bb634627a5e6d9d4   (Required: Yes)
-Param   :  symbols = NGN,USD   (Required: No)
-Status  :  200 OK</w:t>
+        <w:t>Method  :  GET</w:t>
+        <w:br/>
+        <w:t>URL     :  https://openexchangerates.org/api/latest.json?app_id=9069645b9f1f4dc4bb634627a5e6d9d4</w:t>
+        <w:br/>
+        <w:t xml:space="preserve">            &amp;symbols=NGN,USD</w:t>
+        <w:br/>
+        <w:t>Param   :  app_id = 9069645b9f1f4dc4bb634627a5e6d9d4   (Required: Yes)</w:t>
+        <w:br/>
+        <w:t>Param   :  symbols = NGN,USD   (Required: No)</w:t>
+        <w:br/>
+        <w:t>Status  :  200 OK</w:t>
       </w:r>
     </w:p>
     <w:p>
@@ -1795,11 +1809,17 @@
           <w:sz w:val="15"/>
           <w:szCs w:val="15"/>
         </w:rPr>
-        <w:t xml:space="preserve">Method  :  GET
-URL     :  https://openexchangerates.org/api/latest.json?app_id=9069645b9f1f4dc4bb634627a5e6d9d4&amp;symbols=NGN,USD
-Param   :  app_id = 9069645b9f1f4dc4bb634627a5e6d9d4   (Required: Yes)
-Param   :  symbols = NGN,USD   (Required: No)
-Status  :  200 OK</w:t>
+        <w:t>Method  :  GET</w:t>
+        <w:br/>
+        <w:t>URL     :  https://openexchangerates.org/api/latest.json?app_id=9069645b9f1f4dc4bb634627a5e6d9d4</w:t>
+        <w:br/>
+        <w:t xml:space="preserve">            &amp;symbols=NGN,USD</w:t>
+        <w:br/>
+        <w:t>Param   :  app_id = 9069645b9f1f4dc4bb634627a5e6d9d4   (Required: Yes)</w:t>
+        <w:br/>
+        <w:t>Param   :  symbols = NGN,USD   (Required: No)</w:t>
+        <w:br/>
+        <w:t>Status  :  200 OK</w:t>
       </w:r>
     </w:p>
     <w:p>

</xml_diff>

<commit_message>
Style: convert DOCX to full black and white — remove all green backgrounds and coloured text
</commit_message>
<xml_diff>
--- a/CURRENCY_CONVERTER_API_Docs.docx
+++ b/CURRENCY_CONVERTER_API_Docs.docx
@@ -124,14 +124,14 @@
       <w:tr>
         <w:tc>
           <w:tcPr>
-            <w:shd w:fill="dddddd" w:color="dddddd" w:val="solid"/>
+            <w:shd w:fill="333333" w:color="auto" w:val="clear"/>
           </w:tcPr>
           <w:p>
             <w:r>
               <w:rPr>
                 <w:b/>
                 <w:bCs/>
-                <w:color w:val="111111"/>
+                <w:color w:val="ffffff"/>
                 <w:sz w:val="16"/>
                 <w:szCs w:val="16"/>
               </w:rPr>
@@ -141,14 +141,14 @@
         </w:tc>
         <w:tc>
           <w:tcPr>
-            <w:shd w:fill="dddddd" w:color="dddddd" w:val="solid"/>
+            <w:shd w:fill="333333" w:color="auto" w:val="clear"/>
           </w:tcPr>
           <w:p>
             <w:r>
               <w:rPr>
                 <w:b/>
                 <w:bCs/>
-                <w:color w:val="111111"/>
+                <w:color w:val="ffffff"/>
                 <w:sz w:val="16"/>
                 <w:szCs w:val="16"/>
               </w:rPr>
@@ -161,14 +161,14 @@
         <w:tc>
           <w:tcPr>
             <w:tcW w:type="pct" w:w="28%"/>
-            <w:shd w:fill="f5f5f5" w:color="f5f5f5" w:val="solid"/>
+            <w:shd w:fill="ffffff" w:color="auto" w:val="clear"/>
           </w:tcPr>
           <w:p>
             <w:r>
               <w:rPr>
                 <w:b/>
                 <w:bCs/>
-                <w:color w:val="111111"/>
+                <w:color w:val="000000"/>
                 <w:sz w:val="17"/>
                 <w:szCs w:val="17"/>
               </w:rPr>
@@ -179,12 +179,12 @@
         <w:tc>
           <w:tcPr>
             <w:tcW w:type="pct" w:w="72%"/>
-            <w:shd w:fill="f5f5f5" w:color="f5f5f5" w:val="solid"/>
-          </w:tcPr>
-          <w:p>
-            <w:r>
-              <w:rPr>
-                <w:color w:val="444444"/>
+            <w:shd w:fill="ffffff" w:color="auto" w:val="clear"/>
+          </w:tcPr>
+          <w:p>
+            <w:r>
+              <w:rPr>
+                <w:color w:val="000000"/>
                 <w:sz w:val="17"/>
                 <w:szCs w:val="17"/>
               </w:rPr>
@@ -197,14 +197,14 @@
         <w:tc>
           <w:tcPr>
             <w:tcW w:type="pct" w:w="28%"/>
-            <w:shd/>
+            <w:shd w:val="clear" w:color="auto" w:fill="f5f5f5"/>
           </w:tcPr>
           <w:p>
             <w:r>
               <w:rPr>
                 <w:b/>
                 <w:bCs/>
-                <w:color w:val="111111"/>
+                <w:color w:val="000000"/>
                 <w:sz w:val="17"/>
                 <w:szCs w:val="17"/>
               </w:rPr>
@@ -215,12 +215,12 @@
         <w:tc>
           <w:tcPr>
             <w:tcW w:type="pct" w:w="72%"/>
-            <w:shd/>
-          </w:tcPr>
-          <w:p>
-            <w:r>
-              <w:rPr>
-                <w:color w:val="444444"/>
+            <w:shd w:val="clear" w:color="auto" w:fill="f5f5f5"/>
+          </w:tcPr>
+          <w:p>
+            <w:r>
+              <w:rPr>
+                <w:color w:val="000000"/>
                 <w:sz w:val="17"/>
                 <w:szCs w:val="17"/>
               </w:rPr>
@@ -233,14 +233,14 @@
         <w:tc>
           <w:tcPr>
             <w:tcW w:type="pct" w:w="28%"/>
-            <w:shd w:fill="f5f5f5" w:color="f5f5f5" w:val="solid"/>
+            <w:shd w:fill="ffffff" w:color="auto" w:val="clear"/>
           </w:tcPr>
           <w:p>
             <w:r>
               <w:rPr>
                 <w:b/>
                 <w:bCs/>
-                <w:color w:val="111111"/>
+                <w:color w:val="000000"/>
                 <w:sz w:val="17"/>
                 <w:szCs w:val="17"/>
               </w:rPr>
@@ -251,12 +251,12 @@
         <w:tc>
           <w:tcPr>
             <w:tcW w:type="pct" w:w="72%"/>
-            <w:shd w:fill="f5f5f5" w:color="f5f5f5" w:val="solid"/>
-          </w:tcPr>
-          <w:p>
-            <w:r>
-              <w:rPr>
-                <w:color w:val="444444"/>
+            <w:shd w:fill="ffffff" w:color="auto" w:val="clear"/>
+          </w:tcPr>
+          <w:p>
+            <w:r>
+              <w:rPr>
+                <w:color w:val="000000"/>
                 <w:sz w:val="17"/>
                 <w:szCs w:val="17"/>
               </w:rPr>
@@ -269,14 +269,14 @@
         <w:tc>
           <w:tcPr>
             <w:tcW w:type="pct" w:w="28%"/>
-            <w:shd/>
+            <w:shd w:val="clear" w:color="auto" w:fill="f5f5f5"/>
           </w:tcPr>
           <w:p>
             <w:r>
               <w:rPr>
                 <w:b/>
                 <w:bCs/>
-                <w:color w:val="111111"/>
+                <w:color w:val="000000"/>
                 <w:sz w:val="17"/>
                 <w:szCs w:val="17"/>
               </w:rPr>
@@ -287,12 +287,12 @@
         <w:tc>
           <w:tcPr>
             <w:tcW w:type="pct" w:w="72%"/>
-            <w:shd/>
-          </w:tcPr>
-          <w:p>
-            <w:r>
-              <w:rPr>
-                <w:color w:val="444444"/>
+            <w:shd w:val="clear" w:color="auto" w:fill="f5f5f5"/>
+          </w:tcPr>
+          <w:p>
+            <w:r>
+              <w:rPr>
+                <w:color w:val="000000"/>
                 <w:sz w:val="17"/>
                 <w:szCs w:val="17"/>
               </w:rPr>
@@ -305,14 +305,14 @@
         <w:tc>
           <w:tcPr>
             <w:tcW w:type="pct" w:w="28%"/>
-            <w:shd w:fill="f5f5f5" w:color="f5f5f5" w:val="solid"/>
+            <w:shd w:fill="ffffff" w:color="auto" w:val="clear"/>
           </w:tcPr>
           <w:p>
             <w:r>
               <w:rPr>
                 <w:b/>
                 <w:bCs/>
-                <w:color w:val="111111"/>
+                <w:color w:val="000000"/>
                 <w:sz w:val="17"/>
                 <w:szCs w:val="17"/>
               </w:rPr>
@@ -323,12 +323,12 @@
         <w:tc>
           <w:tcPr>
             <w:tcW w:type="pct" w:w="72%"/>
-            <w:shd w:fill="f5f5f5" w:color="f5f5f5" w:val="solid"/>
-          </w:tcPr>
-          <w:p>
-            <w:r>
-              <w:rPr>
-                <w:color w:val="444444"/>
+            <w:shd w:fill="ffffff" w:color="auto" w:val="clear"/>
+          </w:tcPr>
+          <w:p>
+            <w:r>
+              <w:rPr>
+                <w:color w:val="000000"/>
                 <w:sz w:val="17"/>
                 <w:szCs w:val="17"/>
               </w:rPr>
@@ -341,14 +341,14 @@
         <w:tc>
           <w:tcPr>
             <w:tcW w:type="pct" w:w="28%"/>
-            <w:shd/>
+            <w:shd w:val="clear" w:color="auto" w:fill="f5f5f5"/>
           </w:tcPr>
           <w:p>
             <w:r>
               <w:rPr>
                 <w:b/>
                 <w:bCs/>
-                <w:color w:val="111111"/>
+                <w:color w:val="000000"/>
                 <w:sz w:val="17"/>
                 <w:szCs w:val="17"/>
               </w:rPr>
@@ -359,12 +359,12 @@
         <w:tc>
           <w:tcPr>
             <w:tcW w:type="pct" w:w="72%"/>
-            <w:shd/>
-          </w:tcPr>
-          <w:p>
-            <w:r>
-              <w:rPr>
-                <w:color w:val="444444"/>
+            <w:shd w:val="clear" w:color="auto" w:fill="f5f5f5"/>
+          </w:tcPr>
+          <w:p>
+            <w:r>
+              <w:rPr>
+                <w:color w:val="000000"/>
                 <w:sz w:val="17"/>
                 <w:szCs w:val="17"/>
               </w:rPr>
@@ -410,14 +410,14 @@
         <w:tc>
           <w:tcPr>
             <w:tcW w:type="pct" w:w="28%"/>
-            <w:shd w:fill="f5f5f5" w:color="f5f5f5" w:val="solid"/>
+            <w:shd w:fill="333333" w:color="auto" w:val="clear"/>
           </w:tcPr>
           <w:p>
             <w:r>
               <w:rPr>
                 <w:b/>
                 <w:bCs/>
-                <w:color w:val="111111"/>
+                <w:color w:val="ffffff"/>
                 <w:sz w:val="17"/>
                 <w:szCs w:val="17"/>
               </w:rPr>
@@ -428,12 +428,12 @@
         <w:tc>
           <w:tcPr>
             <w:tcW w:type="pct" w:w="72%"/>
-            <w:shd w:fill="f5f5f5" w:color="f5f5f5" w:val="solid"/>
-          </w:tcPr>
-          <w:p>
-            <w:r>
-              <w:rPr>
-                <w:color w:val="444444"/>
+            <w:shd w:fill="333333" w:color="auto" w:val="clear"/>
+          </w:tcPr>
+          <w:p>
+            <w:r>
+              <w:rPr>
+                <w:color w:val="ffffff"/>
                 <w:sz w:val="17"/>
                 <w:szCs w:val="17"/>
               </w:rPr>
@@ -446,14 +446,14 @@
         <w:tc>
           <w:tcPr>
             <w:tcW w:type="pct" w:w="28%"/>
-            <w:shd/>
+            <w:shd w:val="clear" w:color="auto" w:fill="ffffff"/>
           </w:tcPr>
           <w:p>
             <w:r>
               <w:rPr>
                 <w:b/>
                 <w:bCs/>
-                <w:color w:val="111111"/>
+                <w:color w:val="000000"/>
                 <w:sz w:val="17"/>
                 <w:szCs w:val="17"/>
               </w:rPr>
@@ -464,12 +464,12 @@
         <w:tc>
           <w:tcPr>
             <w:tcW w:type="pct" w:w="72%"/>
-            <w:shd/>
-          </w:tcPr>
-          <w:p>
-            <w:r>
-              <w:rPr>
-                <w:color w:val="444444"/>
+            <w:shd w:val="clear" w:color="auto" w:fill="ffffff"/>
+          </w:tcPr>
+          <w:p>
+            <w:r>
+              <w:rPr>
+                <w:color w:val="000000"/>
                 <w:sz w:val="17"/>
                 <w:szCs w:val="17"/>
               </w:rPr>
@@ -482,14 +482,14 @@
         <w:tc>
           <w:tcPr>
             <w:tcW w:type="pct" w:w="28%"/>
-            <w:shd w:fill="f5f5f5" w:color="f5f5f5" w:val="solid"/>
+            <w:shd w:fill="f5f5f5" w:color="auto" w:val="clear"/>
           </w:tcPr>
           <w:p>
             <w:r>
               <w:rPr>
                 <w:b/>
                 <w:bCs/>
-                <w:color w:val="111111"/>
+                <w:color w:val="000000"/>
                 <w:sz w:val="17"/>
                 <w:szCs w:val="17"/>
               </w:rPr>
@@ -500,12 +500,12 @@
         <w:tc>
           <w:tcPr>
             <w:tcW w:type="pct" w:w="72%"/>
-            <w:shd w:fill="f5f5f5" w:color="f5f5f5" w:val="solid"/>
-          </w:tcPr>
-          <w:p>
-            <w:r>
-              <w:rPr>
-                <w:color w:val="444444"/>
+            <w:shd w:fill="f5f5f5" w:color="auto" w:val="clear"/>
+          </w:tcPr>
+          <w:p>
+            <w:r>
+              <w:rPr>
+                <w:color w:val="000000"/>
                 <w:sz w:val="17"/>
                 <w:szCs w:val="17"/>
               </w:rPr>
@@ -518,14 +518,14 @@
         <w:tc>
           <w:tcPr>
             <w:tcW w:type="pct" w:w="28%"/>
-            <w:shd/>
+            <w:shd w:val="clear" w:color="auto" w:fill="ffffff"/>
           </w:tcPr>
           <w:p>
             <w:r>
               <w:rPr>
                 <w:b/>
                 <w:bCs/>
-                <w:color w:val="111111"/>
+                <w:color w:val="000000"/>
                 <w:sz w:val="17"/>
                 <w:szCs w:val="17"/>
               </w:rPr>
@@ -536,12 +536,12 @@
         <w:tc>
           <w:tcPr>
             <w:tcW w:type="pct" w:w="72%"/>
-            <w:shd/>
-          </w:tcPr>
-          <w:p>
-            <w:r>
-              <w:rPr>
-                <w:color w:val="444444"/>
+            <w:shd w:val="clear" w:color="auto" w:fill="ffffff"/>
+          </w:tcPr>
+          <w:p>
+            <w:r>
+              <w:rPr>
+                <w:color w:val="000000"/>
                 <w:sz w:val="17"/>
                 <w:szCs w:val="17"/>
               </w:rPr>
@@ -554,14 +554,14 @@
         <w:tc>
           <w:tcPr>
             <w:tcW w:type="pct" w:w="28%"/>
-            <w:shd w:fill="f5f5f5" w:color="f5f5f5" w:val="solid"/>
+            <w:shd w:fill="f5f5f5" w:color="auto" w:val="clear"/>
           </w:tcPr>
           <w:p>
             <w:r>
               <w:rPr>
                 <w:b/>
                 <w:bCs/>
-                <w:color w:val="111111"/>
+                <w:color w:val="000000"/>
                 <w:sz w:val="17"/>
                 <w:szCs w:val="17"/>
               </w:rPr>
@@ -572,12 +572,12 @@
         <w:tc>
           <w:tcPr>
             <w:tcW w:type="pct" w:w="72%"/>
-            <w:shd w:fill="f5f5f5" w:color="f5f5f5" w:val="solid"/>
-          </w:tcPr>
-          <w:p>
-            <w:r>
-              <w:rPr>
-                <w:color w:val="444444"/>
+            <w:shd w:fill="f5f5f5" w:color="auto" w:val="clear"/>
+          </w:tcPr>
+          <w:p>
+            <w:r>
+              <w:rPr>
+                <w:color w:val="000000"/>
                 <w:sz w:val="17"/>
                 <w:szCs w:val="17"/>
               </w:rPr>
@@ -590,14 +590,14 @@
         <w:tc>
           <w:tcPr>
             <w:tcW w:type="pct" w:w="28%"/>
-            <w:shd/>
+            <w:shd w:val="clear" w:color="auto" w:fill="ffffff"/>
           </w:tcPr>
           <w:p>
             <w:r>
               <w:rPr>
                 <w:b/>
                 <w:bCs/>
-                <w:color w:val="111111"/>
+                <w:color w:val="000000"/>
                 <w:sz w:val="17"/>
                 <w:szCs w:val="17"/>
               </w:rPr>
@@ -608,12 +608,12 @@
         <w:tc>
           <w:tcPr>
             <w:tcW w:type="pct" w:w="72%"/>
-            <w:shd/>
-          </w:tcPr>
-          <w:p>
-            <w:r>
-              <w:rPr>
-                <w:color w:val="444444"/>
+            <w:shd w:val="clear" w:color="auto" w:fill="ffffff"/>
+          </w:tcPr>
+          <w:p>
+            <w:r>
+              <w:rPr>
+                <w:color w:val="000000"/>
                 <w:sz w:val="17"/>
                 <w:szCs w:val="17"/>
               </w:rPr>
@@ -626,14 +626,14 @@
         <w:tc>
           <w:tcPr>
             <w:tcW w:type="pct" w:w="28%"/>
-            <w:shd w:fill="f5f5f5" w:color="f5f5f5" w:val="solid"/>
+            <w:shd w:fill="f5f5f5" w:color="auto" w:val="clear"/>
           </w:tcPr>
           <w:p>
             <w:r>
               <w:rPr>
                 <w:b/>
                 <w:bCs/>
-                <w:color w:val="111111"/>
+                <w:color w:val="000000"/>
                 <w:sz w:val="17"/>
                 <w:szCs w:val="17"/>
               </w:rPr>
@@ -644,12 +644,12 @@
         <w:tc>
           <w:tcPr>
             <w:tcW w:type="pct" w:w="72%"/>
-            <w:shd w:fill="f5f5f5" w:color="f5f5f5" w:val="solid"/>
-          </w:tcPr>
-          <w:p>
-            <w:r>
-              <w:rPr>
-                <w:color w:val="444444"/>
+            <w:shd w:fill="f5f5f5" w:color="auto" w:val="clear"/>
+          </w:tcPr>
+          <w:p>
+            <w:r>
+              <w:rPr>
+                <w:color w:val="000000"/>
                 <w:sz w:val="17"/>
                 <w:szCs w:val="17"/>
               </w:rPr>
@@ -662,14 +662,14 @@
         <w:tc>
           <w:tcPr>
             <w:tcW w:type="pct" w:w="28%"/>
-            <w:shd/>
+            <w:shd w:val="clear" w:color="auto" w:fill="ffffff"/>
           </w:tcPr>
           <w:p>
             <w:r>
               <w:rPr>
                 <w:b/>
                 <w:bCs/>
-                <w:color w:val="111111"/>
+                <w:color w:val="000000"/>
                 <w:sz w:val="17"/>
                 <w:szCs w:val="17"/>
               </w:rPr>
@@ -680,12 +680,12 @@
         <w:tc>
           <w:tcPr>
             <w:tcW w:type="pct" w:w="72%"/>
-            <w:shd/>
-          </w:tcPr>
-          <w:p>
-            <w:r>
-              <w:rPr>
-                <w:color w:val="444444"/>
+            <w:shd w:val="clear" w:color="auto" w:fill="ffffff"/>
+          </w:tcPr>
+          <w:p>
+            <w:r>
+              <w:rPr>
+                <w:color w:val="000000"/>
                 <w:sz w:val="17"/>
                 <w:szCs w:val="17"/>
               </w:rPr>
@@ -698,14 +698,14 @@
         <w:tc>
           <w:tcPr>
             <w:tcW w:type="pct" w:w="28%"/>
-            <w:shd w:fill="f5f5f5" w:color="f5f5f5" w:val="solid"/>
+            <w:shd w:fill="f5f5f5" w:color="auto" w:val="clear"/>
           </w:tcPr>
           <w:p>
             <w:r>
               <w:rPr>
                 <w:b/>
                 <w:bCs/>
-                <w:color w:val="111111"/>
+                <w:color w:val="000000"/>
                 <w:sz w:val="17"/>
                 <w:szCs w:val="17"/>
               </w:rPr>
@@ -716,12 +716,12 @@
         <w:tc>
           <w:tcPr>
             <w:tcW w:type="pct" w:w="72%"/>
-            <w:shd w:fill="f5f5f5" w:color="f5f5f5" w:val="solid"/>
-          </w:tcPr>
-          <w:p>
-            <w:r>
-              <w:rPr>
-                <w:color w:val="444444"/>
+            <w:shd w:fill="f5f5f5" w:color="auto" w:val="clear"/>
+          </w:tcPr>
+          <w:p>
+            <w:r>
+              <w:rPr>
+                <w:color w:val="000000"/>
                 <w:sz w:val="17"/>
                 <w:szCs w:val="17"/>
               </w:rPr>
@@ -769,14 +769,14 @@
       <w:tr>
         <w:tc>
           <w:tcPr>
-            <w:shd w:fill="dddddd" w:color="dddddd" w:val="solid"/>
+            <w:shd w:fill="333333" w:color="auto" w:val="clear"/>
           </w:tcPr>
           <w:p>
             <w:r>
               <w:rPr>
                 <w:b/>
                 <w:bCs/>
-                <w:color w:val="111111"/>
+                <w:color w:val="ffffff"/>
                 <w:sz w:val="16"/>
                 <w:szCs w:val="16"/>
               </w:rPr>
@@ -786,14 +786,14 @@
         </w:tc>
         <w:tc>
           <w:tcPr>
-            <w:shd w:fill="dddddd" w:color="dddddd" w:val="solid"/>
+            <w:shd w:fill="333333" w:color="auto" w:val="clear"/>
           </w:tcPr>
           <w:p>
             <w:r>
               <w:rPr>
                 <w:b/>
                 <w:bCs/>
-                <w:color w:val="111111"/>
+                <w:color w:val="ffffff"/>
                 <w:sz w:val="16"/>
                 <w:szCs w:val="16"/>
               </w:rPr>
@@ -803,14 +803,14 @@
         </w:tc>
         <w:tc>
           <w:tcPr>
-            <w:shd w:fill="dddddd" w:color="dddddd" w:val="solid"/>
+            <w:shd w:fill="333333" w:color="auto" w:val="clear"/>
           </w:tcPr>
           <w:p>
             <w:r>
               <w:rPr>
                 <w:b/>
                 <w:bCs/>
-                <w:color w:val="111111"/>
+                <w:color w:val="ffffff"/>
                 <w:sz w:val="16"/>
                 <w:szCs w:val="16"/>
               </w:rPr>
@@ -820,14 +820,14 @@
         </w:tc>
         <w:tc>
           <w:tcPr>
-            <w:shd w:fill="dddddd" w:color="dddddd" w:val="solid"/>
+            <w:shd w:fill="333333" w:color="auto" w:val="clear"/>
           </w:tcPr>
           <w:p>
             <w:r>
               <w:rPr>
                 <w:b/>
                 <w:bCs/>
-                <w:color w:val="111111"/>
+                <w:color w:val="ffffff"/>
                 <w:sz w:val="16"/>
                 <w:szCs w:val="16"/>
               </w:rPr>
@@ -837,14 +837,14 @@
         </w:tc>
         <w:tc>
           <w:tcPr>
-            <w:shd w:fill="dddddd" w:color="dddddd" w:val="solid"/>
+            <w:shd w:fill="333333" w:color="auto" w:val="clear"/>
           </w:tcPr>
           <w:p>
             <w:r>
               <w:rPr>
                 <w:b/>
                 <w:bCs/>
-                <w:color w:val="111111"/>
+                <w:color w:val="ffffff"/>
                 <w:sz w:val="16"/>
                 <w:szCs w:val="16"/>
               </w:rPr>
@@ -856,12 +856,12 @@
       <w:tr>
         <w:tc>
           <w:tcPr>
-            <w:shd w:fill="f5f5f5" w:color="f5f5f5" w:val="solid"/>
-          </w:tcPr>
-          <w:p>
-            <w:r>
-              <w:rPr>
-                <w:color w:val="444444"/>
+            <w:shd w:fill="ffffff" w:color="auto" w:val="clear"/>
+          </w:tcPr>
+          <w:p>
+            <w:r>
+              <w:rPr>
+                <w:color w:val="000000"/>
                 <w:sz w:val="16"/>
                 <w:szCs w:val="16"/>
               </w:rPr>
@@ -871,12 +871,12 @@
         </w:tc>
         <w:tc>
           <w:tcPr>
-            <w:shd w:fill="f5f5f5" w:color="f5f5f5" w:val="solid"/>
-          </w:tcPr>
-          <w:p>
-            <w:r>
-              <w:rPr>
-                <w:color w:val="444444"/>
+            <w:shd w:fill="ffffff" w:color="auto" w:val="clear"/>
+          </w:tcPr>
+          <w:p>
+            <w:r>
+              <w:rPr>
+                <w:color w:val="000000"/>
                 <w:sz w:val="16"/>
                 <w:szCs w:val="16"/>
               </w:rPr>
@@ -886,13 +886,13 @@
         </w:tc>
         <w:tc>
           <w:tcPr>
-            <w:shd w:fill="f5f5f5" w:color="f5f5f5" w:val="solid"/>
+            <w:shd w:fill="ffffff" w:color="auto" w:val="clear"/>
           </w:tcPr>
           <w:p>
             <w:r>
               <w:rPr>
                 <w:rFonts w:ascii="Arial Unicode MS" w:hAnsi="Arial Unicode MS" w:cs="Arial Unicode MS" w:eastAsia="Arial Unicode MS"/>
-                <w:color w:val="444444"/>
+                <w:color w:val="000000"/>
                 <w:sz w:val="16"/>
                 <w:szCs w:val="16"/>
               </w:rPr>
@@ -902,12 +902,12 @@
         </w:tc>
         <w:tc>
           <w:tcPr>
-            <w:shd w:fill="f5f5f5" w:color="f5f5f5" w:val="solid"/>
-          </w:tcPr>
-          <w:p>
-            <w:r>
-              <w:rPr>
-                <w:color w:val="444444"/>
+            <w:shd w:fill="ffffff" w:color="auto" w:val="clear"/>
+          </w:tcPr>
+          <w:p>
+            <w:r>
+              <w:rPr>
+                <w:color w:val="000000"/>
                 <w:sz w:val="16"/>
                 <w:szCs w:val="16"/>
               </w:rPr>
@@ -917,12 +917,12 @@
         </w:tc>
         <w:tc>
           <w:tcPr>
-            <w:shd w:fill="f5f5f5" w:color="f5f5f5" w:val="solid"/>
-          </w:tcPr>
-          <w:p>
-            <w:r>
-              <w:rPr>
-                <w:color w:val="444444"/>
+            <w:shd w:fill="ffffff" w:color="auto" w:val="clear"/>
+          </w:tcPr>
+          <w:p>
+            <w:r>
+              <w:rPr>
+                <w:color w:val="000000"/>
                 <w:sz w:val="16"/>
                 <w:szCs w:val="16"/>
               </w:rPr>
@@ -934,12 +934,12 @@
       <w:tr>
         <w:tc>
           <w:tcPr>
-            <w:shd/>
-          </w:tcPr>
-          <w:p>
-            <w:r>
-              <w:rPr>
-                <w:color w:val="444444"/>
+            <w:shd w:val="clear" w:color="auto" w:fill="f5f5f5"/>
+          </w:tcPr>
+          <w:p>
+            <w:r>
+              <w:rPr>
+                <w:color w:val="000000"/>
                 <w:sz w:val="16"/>
                 <w:szCs w:val="16"/>
               </w:rPr>
@@ -949,12 +949,12 @@
         </w:tc>
         <w:tc>
           <w:tcPr>
-            <w:shd/>
-          </w:tcPr>
-          <w:p>
-            <w:r>
-              <w:rPr>
-                <w:color w:val="444444"/>
+            <w:shd w:val="clear" w:color="auto" w:fill="f5f5f5"/>
+          </w:tcPr>
+          <w:p>
+            <w:r>
+              <w:rPr>
+                <w:color w:val="000000"/>
                 <w:sz w:val="16"/>
                 <w:szCs w:val="16"/>
               </w:rPr>
@@ -964,12 +964,12 @@
         </w:tc>
         <w:tc>
           <w:tcPr>
-            <w:shd/>
-          </w:tcPr>
-          <w:p>
-            <w:r>
-              <w:rPr>
-                <w:color w:val="444444"/>
+            <w:shd w:val="clear" w:color="auto" w:fill="f5f5f5"/>
+          </w:tcPr>
+          <w:p>
+            <w:r>
+              <w:rPr>
+                <w:color w:val="000000"/>
                 <w:sz w:val="16"/>
                 <w:szCs w:val="16"/>
               </w:rPr>
@@ -979,12 +979,12 @@
         </w:tc>
         <w:tc>
           <w:tcPr>
-            <w:shd/>
-          </w:tcPr>
-          <w:p>
-            <w:r>
-              <w:rPr>
-                <w:color w:val="444444"/>
+            <w:shd w:val="clear" w:color="auto" w:fill="f5f5f5"/>
+          </w:tcPr>
+          <w:p>
+            <w:r>
+              <w:rPr>
+                <w:color w:val="000000"/>
                 <w:sz w:val="16"/>
                 <w:szCs w:val="16"/>
               </w:rPr>
@@ -994,12 +994,12 @@
         </w:tc>
         <w:tc>
           <w:tcPr>
-            <w:shd/>
-          </w:tcPr>
-          <w:p>
-            <w:r>
-              <w:rPr>
-                <w:color w:val="444444"/>
+            <w:shd w:val="clear" w:color="auto" w:fill="f5f5f5"/>
+          </w:tcPr>
+          <w:p>
+            <w:r>
+              <w:rPr>
+                <w:color w:val="000000"/>
                 <w:sz w:val="16"/>
                 <w:szCs w:val="16"/>
               </w:rPr>
@@ -1011,12 +1011,12 @@
       <w:tr>
         <w:tc>
           <w:tcPr>
-            <w:shd w:fill="f5f5f5" w:color="f5f5f5" w:val="solid"/>
-          </w:tcPr>
-          <w:p>
-            <w:r>
-              <w:rPr>
-                <w:color w:val="444444"/>
+            <w:shd w:fill="ffffff" w:color="auto" w:val="clear"/>
+          </w:tcPr>
+          <w:p>
+            <w:r>
+              <w:rPr>
+                <w:color w:val="000000"/>
                 <w:sz w:val="16"/>
                 <w:szCs w:val="16"/>
               </w:rPr>
@@ -1026,12 +1026,12 @@
         </w:tc>
         <w:tc>
           <w:tcPr>
-            <w:shd w:fill="f5f5f5" w:color="f5f5f5" w:val="solid"/>
-          </w:tcPr>
-          <w:p>
-            <w:r>
-              <w:rPr>
-                <w:color w:val="444444"/>
+            <w:shd w:fill="ffffff" w:color="auto" w:val="clear"/>
+          </w:tcPr>
+          <w:p>
+            <w:r>
+              <w:rPr>
+                <w:color w:val="000000"/>
                 <w:sz w:val="16"/>
                 <w:szCs w:val="16"/>
               </w:rPr>
@@ -1041,12 +1041,12 @@
         </w:tc>
         <w:tc>
           <w:tcPr>
-            <w:shd w:fill="f5f5f5" w:color="f5f5f5" w:val="solid"/>
-          </w:tcPr>
-          <w:p>
-            <w:r>
-              <w:rPr>
-                <w:color w:val="444444"/>
+            <w:shd w:fill="ffffff" w:color="auto" w:val="clear"/>
+          </w:tcPr>
+          <w:p>
+            <w:r>
+              <w:rPr>
+                <w:color w:val="000000"/>
                 <w:sz w:val="16"/>
                 <w:szCs w:val="16"/>
               </w:rPr>
@@ -1056,12 +1056,12 @@
         </w:tc>
         <w:tc>
           <w:tcPr>
-            <w:shd w:fill="f5f5f5" w:color="f5f5f5" w:val="solid"/>
-          </w:tcPr>
-          <w:p>
-            <w:r>
-              <w:rPr>
-                <w:color w:val="444444"/>
+            <w:shd w:fill="ffffff" w:color="auto" w:val="clear"/>
+          </w:tcPr>
+          <w:p>
+            <w:r>
+              <w:rPr>
+                <w:color w:val="000000"/>
                 <w:sz w:val="16"/>
                 <w:szCs w:val="16"/>
               </w:rPr>
@@ -1071,12 +1071,12 @@
         </w:tc>
         <w:tc>
           <w:tcPr>
-            <w:shd w:fill="f5f5f5" w:color="f5f5f5" w:val="solid"/>
-          </w:tcPr>
-          <w:p>
-            <w:r>
-              <w:rPr>
-                <w:color w:val="444444"/>
+            <w:shd w:fill="ffffff" w:color="auto" w:val="clear"/>
+          </w:tcPr>
+          <w:p>
+            <w:r>
+              <w:rPr>
+                <w:color w:val="000000"/>
                 <w:sz w:val="16"/>
                 <w:szCs w:val="16"/>
               </w:rPr>
@@ -1088,12 +1088,12 @@
       <w:tr>
         <w:tc>
           <w:tcPr>
-            <w:shd/>
-          </w:tcPr>
-          <w:p>
-            <w:r>
-              <w:rPr>
-                <w:color w:val="444444"/>
+            <w:shd w:val="clear" w:color="auto" w:fill="f5f5f5"/>
+          </w:tcPr>
+          <w:p>
+            <w:r>
+              <w:rPr>
+                <w:color w:val="000000"/>
                 <w:sz w:val="16"/>
                 <w:szCs w:val="16"/>
               </w:rPr>
@@ -1103,12 +1103,12 @@
         </w:tc>
         <w:tc>
           <w:tcPr>
-            <w:shd/>
-          </w:tcPr>
-          <w:p>
-            <w:r>
-              <w:rPr>
-                <w:color w:val="444444"/>
+            <w:shd w:val="clear" w:color="auto" w:fill="f5f5f5"/>
+          </w:tcPr>
+          <w:p>
+            <w:r>
+              <w:rPr>
+                <w:color w:val="000000"/>
                 <w:sz w:val="16"/>
                 <w:szCs w:val="16"/>
               </w:rPr>
@@ -1118,12 +1118,12 @@
         </w:tc>
         <w:tc>
           <w:tcPr>
-            <w:shd/>
-          </w:tcPr>
-          <w:p>
-            <w:r>
-              <w:rPr>
-                <w:color w:val="444444"/>
+            <w:shd w:val="clear" w:color="auto" w:fill="f5f5f5"/>
+          </w:tcPr>
+          <w:p>
+            <w:r>
+              <w:rPr>
+                <w:color w:val="000000"/>
                 <w:sz w:val="16"/>
                 <w:szCs w:val="16"/>
               </w:rPr>
@@ -1133,12 +1133,12 @@
         </w:tc>
         <w:tc>
           <w:tcPr>
-            <w:shd/>
-          </w:tcPr>
-          <w:p>
-            <w:r>
-              <w:rPr>
-                <w:color w:val="444444"/>
+            <w:shd w:val="clear" w:color="auto" w:fill="f5f5f5"/>
+          </w:tcPr>
+          <w:p>
+            <w:r>
+              <w:rPr>
+                <w:color w:val="000000"/>
                 <w:sz w:val="16"/>
                 <w:szCs w:val="16"/>
               </w:rPr>
@@ -1148,12 +1148,12 @@
         </w:tc>
         <w:tc>
           <w:tcPr>
-            <w:shd/>
-          </w:tcPr>
-          <w:p>
-            <w:r>
-              <w:rPr>
-                <w:color w:val="444444"/>
+            <w:shd w:val="clear" w:color="auto" w:fill="f5f5f5"/>
+          </w:tcPr>
+          <w:p>
+            <w:r>
+              <w:rPr>
+                <w:color w:val="000000"/>
                 <w:sz w:val="16"/>
                 <w:szCs w:val="16"/>
               </w:rPr>
@@ -1165,12 +1165,12 @@
       <w:tr>
         <w:tc>
           <w:tcPr>
-            <w:shd w:fill="f5f5f5" w:color="f5f5f5" w:val="solid"/>
-          </w:tcPr>
-          <w:p>
-            <w:r>
-              <w:rPr>
-                <w:color w:val="444444"/>
+            <w:shd w:fill="ffffff" w:color="auto" w:val="clear"/>
+          </w:tcPr>
+          <w:p>
+            <w:r>
+              <w:rPr>
+                <w:color w:val="000000"/>
                 <w:sz w:val="16"/>
                 <w:szCs w:val="16"/>
               </w:rPr>
@@ -1180,12 +1180,12 @@
         </w:tc>
         <w:tc>
           <w:tcPr>
-            <w:shd w:fill="f5f5f5" w:color="f5f5f5" w:val="solid"/>
-          </w:tcPr>
-          <w:p>
-            <w:r>
-              <w:rPr>
-                <w:color w:val="444444"/>
+            <w:shd w:fill="ffffff" w:color="auto" w:val="clear"/>
+          </w:tcPr>
+          <w:p>
+            <w:r>
+              <w:rPr>
+                <w:color w:val="000000"/>
                 <w:sz w:val="16"/>
                 <w:szCs w:val="16"/>
               </w:rPr>
@@ -1195,13 +1195,13 @@
         </w:tc>
         <w:tc>
           <w:tcPr>
-            <w:shd w:fill="f5f5f5" w:color="f5f5f5" w:val="solid"/>
+            <w:shd w:fill="ffffff" w:color="auto" w:val="clear"/>
           </w:tcPr>
           <w:p>
             <w:r>
               <w:rPr>
                 <w:rFonts w:ascii="Arial Unicode MS" w:hAnsi="Arial Unicode MS" w:cs="Arial Unicode MS" w:eastAsia="Arial Unicode MS"/>
-                <w:color w:val="444444"/>
+                <w:color w:val="000000"/>
                 <w:sz w:val="16"/>
                 <w:szCs w:val="16"/>
               </w:rPr>
@@ -1211,12 +1211,12 @@
         </w:tc>
         <w:tc>
           <w:tcPr>
-            <w:shd w:fill="f5f5f5" w:color="f5f5f5" w:val="solid"/>
-          </w:tcPr>
-          <w:p>
-            <w:r>
-              <w:rPr>
-                <w:color w:val="444444"/>
+            <w:shd w:fill="ffffff" w:color="auto" w:val="clear"/>
+          </w:tcPr>
+          <w:p>
+            <w:r>
+              <w:rPr>
+                <w:color w:val="000000"/>
                 <w:sz w:val="16"/>
                 <w:szCs w:val="16"/>
               </w:rPr>
@@ -1226,12 +1226,12 @@
         </w:tc>
         <w:tc>
           <w:tcPr>
-            <w:shd w:fill="f5f5f5" w:color="f5f5f5" w:val="solid"/>
-          </w:tcPr>
-          <w:p>
-            <w:r>
-              <w:rPr>
-                <w:color w:val="444444"/>
+            <w:shd w:fill="ffffff" w:color="auto" w:val="clear"/>
+          </w:tcPr>
+          <w:p>
+            <w:r>
+              <w:rPr>
+                <w:color w:val="000000"/>
                 <w:sz w:val="16"/>
                 <w:szCs w:val="16"/>
               </w:rPr>

</xml_diff>